<commit_message>
Privacy policy corrections; remove Instagram; cleaned docs; title typos
- Privacy policy: Google Apps Script/Sheets (not Formspree), handrada.com,
  accurate cookie/storage wording, reCAPTCHA scope, updated date.
- Site identity data (schema.org Person): Instagram removed from sameAs.
- CV, artwork labels, submission package, email template: Instagram
  handles removed, template email now louis.andrada@outlook.com.
- /docs, /cv and the About page CV link now open these cleaned PDFs
  from handrada.com instead of the old copies on GitHub.
- Titles: "Reflection of the Last Sight", "Elders Responsibility".

Co-Authored-By: Claude Opus 5.5 <noreply@anthropic.com>
Claude-Session: https://claude.ai/code/session_01ChNvAXYcxnvFH5F1q7skri
</commit_message>
<xml_diff>
--- a/static/images/docs/Louis_Andrada_Artwork_labels.docx
+++ b/static/images/docs/Louis_Andrada_Artwork_labels.docx
@@ -322,7 +322,7 @@
           <w:sz w:val="12"/>
           <w:szCs w:val="12"/>
         </w:rPr>
-        <w:t>@louisandrada</w:t>
+        <w:t/>
       </w:r>
       <w:r>
         <w:rPr>
@@ -654,7 +654,7 @@
           <w:sz w:val="12"/>
           <w:szCs w:val="12"/>
         </w:rPr>
-        <w:t>@louisandrada</w:t>
+        <w:t/>
       </w:r>
     </w:p>
     <w:p>
@@ -978,7 +978,7 @@
           <w:sz w:val="12"/>
           <w:szCs w:val="12"/>
         </w:rPr>
-        <w:t>@louisandrada</w:t>
+        <w:t/>
       </w:r>
     </w:p>
     <w:p>
@@ -1271,7 +1271,7 @@
           <w:sz w:val="12"/>
           <w:szCs w:val="12"/>
         </w:rPr>
-        <w:t>@louisandrada</w:t>
+        <w:t/>
       </w:r>
     </w:p>
     <w:p>
@@ -1585,7 +1585,7 @@
           <w:sz w:val="12"/>
           <w:szCs w:val="12"/>
         </w:rPr>
-        <w:t>@louisandrada</w:t>
+        <w:t/>
       </w:r>
     </w:p>
     <w:p>
@@ -1907,7 +1907,7 @@
           <w:sz w:val="12"/>
           <w:szCs w:val="12"/>
         </w:rPr>
-        <w:t>@louisandrada</w:t>
+        <w:t/>
       </w:r>
     </w:p>
     <w:p>
@@ -2239,7 +2239,7 @@
           <w:sz w:val="12"/>
           <w:szCs w:val="12"/>
         </w:rPr>
-        <w:t>@louisandrada</w:t>
+        <w:t/>
       </w:r>
     </w:p>
     <w:p>
@@ -2548,7 +2548,7 @@
           <w:sz w:val="12"/>
           <w:szCs w:val="12"/>
         </w:rPr>
-        <w:t>@louisandrada</w:t>
+        <w:t/>
       </w:r>
     </w:p>
     <w:p>
@@ -2894,7 +2894,7 @@
           <w:sz w:val="12"/>
           <w:szCs w:val="12"/>
         </w:rPr>
-        <w:t>@louisandrada</w:t>
+        <w:t/>
       </w:r>
     </w:p>
     <w:p>
@@ -3198,7 +3198,7 @@
           <w:sz w:val="12"/>
           <w:szCs w:val="12"/>
         </w:rPr>
-        <w:t>@louisandrada</w:t>
+        <w:t/>
       </w:r>
     </w:p>
     <w:sectPr>

</xml_diff>